<commit_message>
fix doc rajal klaim resume
</commit_message>
<xml_diff>
--- a/public/doc/klaim/resumemedis/rawatjalan.docx
+++ b/public/doc/klaim/resumemedis/rawatjalan.docx
@@ -2292,6 +2292,7 @@
           </w:tcPr>
           <w:p>
             <w:pPr>
+              <w:keepNext/>
               <w:widowControl w:val="0"/>
               <w:jc w:val="center"/>
               <w:rPr>
@@ -2429,6 +2430,7 @@
           </w:p>
           <w:p>
             <w:pPr>
+              <w:keepNext/>
               <w:widowControl w:val="0"/>
               <w:jc w:val="center"/>
               <w:rPr>
@@ -2438,6 +2440,7 @@
           </w:p>
           <w:p>
             <w:pPr>
+              <w:keepNext/>
               <w:widowControl w:val="0"/>
               <w:jc w:val="center"/>
               <w:rPr>
@@ -2447,6 +2450,7 @@
           </w:p>
           <w:p>
             <w:pPr>
+              <w:keepNext/>
               <w:widowControl w:val="0"/>
               <w:jc w:val="center"/>
               <w:rPr>
@@ -2456,6 +2460,7 @@
           </w:p>
           <w:p>
             <w:pPr>
+              <w:keepNext/>
               <w:widowControl w:val="0"/>
               <w:jc w:val="center"/>
               <w:rPr>
@@ -2465,6 +2470,7 @@
           </w:p>
           <w:p>
             <w:pPr>
+              <w:keepNext/>
               <w:widowControl w:val="0"/>
               <w:jc w:val="center"/>
               <w:rPr>
@@ -2474,6 +2480,7 @@
           </w:p>
           <w:p>
             <w:pPr>
+              <w:keepNext/>
               <w:widowControl w:val="0"/>
               <w:jc w:val="center"/>
               <w:rPr>
@@ -2483,6 +2490,7 @@
           </w:p>
           <w:p>
             <w:pPr>
+              <w:keepNext/>
               <w:widowControl w:val="0"/>
               <w:jc w:val="center"/>
               <w:rPr>
@@ -2492,6 +2500,7 @@
           </w:p>
           <w:p>
             <w:pPr>
+              <w:keepNext/>
               <w:widowControl w:val="0"/>
               <w:jc w:val="center"/>
             </w:pPr>
@@ -2544,6 +2553,7 @@
                 </w:tcPr>
                 <w:p>
                   <w:pPr>
+                    <w:keepNext/>
                     <w:jc w:val="center"/>
                     <w:rPr>
                       <w:sz w:val="14"/>
@@ -2577,6 +2587,7 @@
                 </w:tcPr>
                 <w:p>
                   <w:pPr>
+                    <w:keepNext/>
                     <w:jc w:val="center"/>
                     <w:rPr>
                       <w:sz w:val="14"/>
@@ -2602,6 +2613,7 @@
                 </w:tcPr>
                 <w:p>
                   <w:pPr>
+                    <w:keepNext/>
                     <w:jc w:val="center"/>
                     <w:rPr>
                       <w:sz w:val="14"/>
@@ -2649,6 +2661,7 @@
                 </w:tcPr>
                 <w:p>
                   <w:pPr>
+                    <w:keepNext/>
                     <w:rPr>
                       <w:sz w:val="14"/>
                       <w:szCs w:val="14"/>
@@ -2669,6 +2682,7 @@
                 </w:tcPr>
                 <w:p>
                   <w:pPr>
+                    <w:keepNext/>
                     <w:jc w:val="center"/>
                     <w:rPr>
                       <w:sz w:val="14"/>
@@ -2690,6 +2704,7 @@
                 </w:tcPr>
                 <w:p>
                   <w:pPr>
+                    <w:keepNext/>
                     <w:jc w:val="center"/>
                     <w:rPr>
                       <w:sz w:val="14"/>
@@ -2709,6 +2724,7 @@
           </w:tbl>
           <w:p>
             <w:pPr>
+              <w:keepNext/>
               <w:widowControl w:val="0"/>
             </w:pPr>
           </w:p>

</xml_diff>